<commit_message>
Documentação com ODS ONU
</commit_message>
<xml_diff>
--- a/Documentação.docx
+++ b/Documentação.docx
@@ -786,7 +786,149 @@
     </w:p>
     <w:p>
       <w:pPr>
+        <w:pStyle w:val="NormalWeb"/>
         <w:jc w:val="both"/>
+        <w:rPr>
+          <w:rFonts w:asciiTheme="minorHAnsi" w:hAnsiTheme="minorHAnsi"/>
+        </w:rPr>
+      </w:pPr>
+      <w:r>
+        <w:rPr>
+          <w:rFonts w:asciiTheme="minorHAnsi" w:hAnsiTheme="minorHAnsi"/>
+        </w:rPr>
+        <w:t>Além de que, o projeto tem como associação à</w:t>
+      </w:r>
+      <w:r>
+        <w:rPr>
+          <w:rFonts w:asciiTheme="minorHAnsi" w:hAnsiTheme="minorHAnsi"/>
+          <w:b/>
+          <w:bCs/>
+        </w:rPr>
+        <w:t xml:space="preserve"> </w:t>
+      </w:r>
+      <w:r>
+        <w:rPr>
+          <w:rFonts w:asciiTheme="minorHAnsi" w:hAnsiTheme="minorHAnsi"/>
+          <w:b/>
+          <w:bCs/>
+        </w:rPr>
+        <w:t>ODS 3 da ONU</w:t>
+      </w:r>
+      <w:r>
+        <w:rPr>
+          <w:rFonts w:asciiTheme="minorHAnsi" w:hAnsiTheme="minorHAnsi"/>
+        </w:rPr>
+        <w:t>:</w:t>
+      </w:r>
+      <w:r>
+        <w:rPr>
+          <w:rFonts w:asciiTheme="minorHAnsi" w:hAnsiTheme="minorHAnsi"/>
+        </w:rPr>
+        <w:t xml:space="preserve"> </w:t>
+      </w:r>
+      <w:r>
+        <w:rPr>
+          <w:rFonts w:asciiTheme="minorHAnsi" w:hAnsiTheme="minorHAnsi"/>
+        </w:rPr>
+        <w:t>“Assegurar uma vida saudável e promover o bem-estar para todos, em todas as idades.”</w:t>
+      </w:r>
+      <w:r>
+        <w:rPr>
+          <w:rFonts w:asciiTheme="minorHAnsi" w:hAnsiTheme="minorHAnsi"/>
+        </w:rPr>
+        <w:t xml:space="preserve"> </w:t>
+      </w:r>
+      <w:r>
+        <w:rPr>
+          <w:rFonts w:asciiTheme="minorHAnsi" w:hAnsiTheme="minorHAnsi"/>
+        </w:rPr>
+        <w:t>O jogo colaborativo propõe uma alternativa criativa e socialmente ativa para promover a saúde mental desde a infância, o que está diretamente ligado à prevenção de problemas como ansiedade, depressão e isolamento emocional na adolescência e vida adulta.</w:t>
+      </w:r>
+      <w:r>
+        <w:rPr>
+          <w:rFonts w:asciiTheme="minorHAnsi" w:hAnsiTheme="minorHAnsi"/>
+        </w:rPr>
+        <w:t xml:space="preserve"> </w:t>
+      </w:r>
+    </w:p>
+    <w:p>
+      <w:pPr>
+        <w:pStyle w:val="NormalWeb"/>
+        <w:rPr>
+          <w:rFonts w:asciiTheme="minorHAnsi" w:hAnsiTheme="minorHAnsi"/>
+        </w:rPr>
+      </w:pPr>
+      <w:r>
+        <w:rPr>
+          <w:rFonts w:asciiTheme="minorHAnsi" w:hAnsiTheme="minorHAnsi"/>
+          <w:b/>
+          <w:bCs/>
+        </w:rPr>
+        <w:t>Promoção da saúde mental preventiva</w:t>
+      </w:r>
+      <w:r>
+        <w:rPr>
+          <w:rFonts w:asciiTheme="minorHAnsi" w:hAnsiTheme="minorHAnsi"/>
+        </w:rPr>
+        <w:t>:</w:t>
+      </w:r>
+      <w:r>
+        <w:rPr>
+          <w:rFonts w:asciiTheme="minorHAnsi" w:hAnsiTheme="minorHAnsi"/>
+        </w:rPr>
+        <w:br/>
+        <w:t>Estimulando o convívio, a empatia e a cooperação por meio da arte e da brincadeira, o projeto ajuda no desenvolvimento de resiliência emocional, reduzindo riscos de transtornos mentais futuros.</w:t>
+      </w:r>
+    </w:p>
+    <w:p>
+      <w:pPr>
+        <w:pStyle w:val="NormalWeb"/>
+        <w:rPr>
+          <w:rFonts w:asciiTheme="minorHAnsi" w:hAnsiTheme="minorHAnsi"/>
+        </w:rPr>
+      </w:pPr>
+      <w:r>
+        <w:rPr>
+          <w:rFonts w:asciiTheme="minorHAnsi" w:hAnsiTheme="minorHAnsi"/>
+          <w:b/>
+          <w:bCs/>
+        </w:rPr>
+        <w:t>Redução dos impactos do isolamento social:</w:t>
+      </w:r>
+      <w:r>
+        <w:rPr>
+          <w:rFonts w:asciiTheme="minorHAnsi" w:hAnsiTheme="minorHAnsi"/>
+        </w:rPr>
+        <w:br/>
+        <w:t>Estudos apontam que a solidão e o afastamento social na infância têm relação com maiores índices de depressão na vida adulta. Ao incentivar interações colaborativas, o projeto atua diretamente nesse fator de risco.</w:t>
+      </w:r>
+    </w:p>
+    <w:p>
+      <w:pPr>
+        <w:pStyle w:val="NormalWeb"/>
+        <w:rPr>
+          <w:rFonts w:asciiTheme="minorHAnsi" w:hAnsiTheme="minorHAnsi"/>
+        </w:rPr>
+      </w:pPr>
+      <w:r>
+        <w:rPr>
+          <w:rFonts w:asciiTheme="minorHAnsi" w:hAnsiTheme="minorHAnsi"/>
+          <w:b/>
+          <w:bCs/>
+        </w:rPr>
+        <w:t>Ambiente digital positivo:</w:t>
+      </w:r>
+      <w:r>
+        <w:rPr>
+          <w:rFonts w:asciiTheme="minorHAnsi" w:hAnsiTheme="minorHAnsi"/>
+        </w:rPr>
+        <w:br/>
+        <w:t>Oferece um espaço seguro para expressão emocional, fortalecendo a autoestima e o senso de pertencimento.</w:t>
+      </w:r>
+    </w:p>
+    <w:p>
+      <w:pPr>
+        <w:pStyle w:val="NormalWeb"/>
       </w:pPr>
     </w:p>
     <w:p>
@@ -1404,6 +1546,7 @@
           </w:tcPr>
           <w:p>
             <w:r>
+              <w:lastRenderedPageBreak/>
               <w:t>RF01.5</w:t>
             </w:r>
           </w:p>
@@ -2050,7 +2193,6 @@
           </w:tcPr>
           <w:p>
             <w:r>
-              <w:lastRenderedPageBreak/>
               <w:t>RF04.1</w:t>
             </w:r>
           </w:p>
@@ -2663,6 +2805,7 @@
           </w:tcPr>
           <w:p>
             <w:r>
+              <w:lastRenderedPageBreak/>
               <w:t>RF06.3</w:t>
             </w:r>
           </w:p>
@@ -3218,7 +3361,6 @@
           </w:tcPr>
           <w:p>
             <w:r>
-              <w:lastRenderedPageBreak/>
               <w:t>RF09.1</w:t>
             </w:r>
           </w:p>
@@ -4081,6 +4223,7 @@
                     <w:spacing w:after="0"/>
                   </w:pPr>
                   <w:r>
+                    <w:lastRenderedPageBreak/>
                     <w:t xml:space="preserve">Comunicação </w:t>
                   </w:r>
                   <w:proofErr w:type="spellStart"/>
@@ -4110,6 +4253,7 @@
               <w:cnfStyle w:val="000000000000" w:firstRow="0" w:lastRow="0" w:firstColumn="0" w:lastColumn="0" w:oddVBand="0" w:evenVBand="0" w:oddHBand="0" w:evenHBand="0" w:firstRowFirstColumn="0" w:firstRowLastColumn="0" w:lastRowFirstColumn="0" w:lastRowLastColumn="0"/>
             </w:pPr>
             <w:r>
+              <w:lastRenderedPageBreak/>
               <w:t>Importante</w:t>
             </w:r>
           </w:p>
@@ -4556,7 +4700,6 @@
           </w:tcPr>
           <w:p>
             <w:r>
-              <w:lastRenderedPageBreak/>
               <w:t>RNF</w:t>
             </w:r>
             <w:r>
@@ -5281,7 +5424,11 @@
                     <w:spacing w:after="0"/>
                   </w:pPr>
                   <w:r>
-                    <w:t>Escalabilidade: arquitetura preparada para futuras expansões</w:t>
+                    <w:t xml:space="preserve">Escalabilidade: arquitetura preparada </w:t>
+                  </w:r>
+                  <w:r>
+                    <w:lastRenderedPageBreak/>
+                    <w:t>para futuras expansões</w:t>
                   </w:r>
                 </w:p>
               </w:tc>
@@ -5302,6 +5449,7 @@
               <w:cnfStyle w:val="000000100000" w:firstRow="0" w:lastRow="0" w:firstColumn="0" w:lastColumn="0" w:oddVBand="0" w:evenVBand="0" w:oddHBand="1" w:evenHBand="0" w:firstRowFirstColumn="0" w:firstRowLastColumn="0" w:lastRowFirstColumn="0" w:lastRowLastColumn="0"/>
             </w:pPr>
             <w:r>
+              <w:lastRenderedPageBreak/>
               <w:t>Desejável</w:t>
             </w:r>
           </w:p>
@@ -6043,9 +6191,9 @@
     </w:lvl>
   </w:abstractNum>
   <w:abstractNum w:abstractNumId="2" w15:restartNumberingAfterBreak="0">
-    <w:nsid w:val="513F1E0C"/>
+    <w:nsid w:val="33795B1F"/>
     <w:multiLevelType w:val="multilevel"/>
-    <w:tmpl w:val="BCD24872"/>
+    <w:tmpl w:val="06845720"/>
     <w:lvl w:ilvl="0">
       <w:start w:val="1"/>
       <w:numFmt w:val="bullet"/>
@@ -6192,9 +6340,9 @@
     </w:lvl>
   </w:abstractNum>
   <w:abstractNum w:abstractNumId="3" w15:restartNumberingAfterBreak="0">
-    <w:nsid w:val="543C4061"/>
+    <w:nsid w:val="513F1E0C"/>
     <w:multiLevelType w:val="multilevel"/>
-    <w:tmpl w:val="286AF16C"/>
+    <w:tmpl w:val="BCD24872"/>
     <w:lvl w:ilvl="0">
       <w:start w:val="1"/>
       <w:numFmt w:val="bullet"/>
@@ -6341,6 +6489,155 @@
     </w:lvl>
   </w:abstractNum>
   <w:abstractNum w:abstractNumId="4" w15:restartNumberingAfterBreak="0">
+    <w:nsid w:val="543C4061"/>
+    <w:multiLevelType w:val="multilevel"/>
+    <w:tmpl w:val="286AF16C"/>
+    <w:lvl w:ilvl="0">
+      <w:start w:val="1"/>
+      <w:numFmt w:val="bullet"/>
+      <w:lvlText w:val=""/>
+      <w:lvlJc w:val="left"/>
+      <w:pPr>
+        <w:tabs>
+          <w:tab w:val="num" w:pos="720"/>
+        </w:tabs>
+        <w:ind w:left="720" w:hanging="360"/>
+      </w:pPr>
+      <w:rPr>
+        <w:rFonts w:ascii="Symbol" w:hAnsi="Symbol" w:hint="default"/>
+        <w:sz w:val="20"/>
+      </w:rPr>
+    </w:lvl>
+    <w:lvl w:ilvl="1" w:tentative="1">
+      <w:start w:val="1"/>
+      <w:numFmt w:val="bullet"/>
+      <w:lvlText w:val="o"/>
+      <w:lvlJc w:val="left"/>
+      <w:pPr>
+        <w:tabs>
+          <w:tab w:val="num" w:pos="1440"/>
+        </w:tabs>
+        <w:ind w:left="1440" w:hanging="360"/>
+      </w:pPr>
+      <w:rPr>
+        <w:rFonts w:ascii="Courier New" w:hAnsi="Courier New" w:hint="default"/>
+        <w:sz w:val="20"/>
+      </w:rPr>
+    </w:lvl>
+    <w:lvl w:ilvl="2" w:tentative="1">
+      <w:start w:val="1"/>
+      <w:numFmt w:val="bullet"/>
+      <w:lvlText w:val=""/>
+      <w:lvlJc w:val="left"/>
+      <w:pPr>
+        <w:tabs>
+          <w:tab w:val="num" w:pos="2160"/>
+        </w:tabs>
+        <w:ind w:left="2160" w:hanging="360"/>
+      </w:pPr>
+      <w:rPr>
+        <w:rFonts w:ascii="Wingdings" w:hAnsi="Wingdings" w:hint="default"/>
+        <w:sz w:val="20"/>
+      </w:rPr>
+    </w:lvl>
+    <w:lvl w:ilvl="3" w:tentative="1">
+      <w:start w:val="1"/>
+      <w:numFmt w:val="bullet"/>
+      <w:lvlText w:val=""/>
+      <w:lvlJc w:val="left"/>
+      <w:pPr>
+        <w:tabs>
+          <w:tab w:val="num" w:pos="2880"/>
+        </w:tabs>
+        <w:ind w:left="2880" w:hanging="360"/>
+      </w:pPr>
+      <w:rPr>
+        <w:rFonts w:ascii="Wingdings" w:hAnsi="Wingdings" w:hint="default"/>
+        <w:sz w:val="20"/>
+      </w:rPr>
+    </w:lvl>
+    <w:lvl w:ilvl="4" w:tentative="1">
+      <w:start w:val="1"/>
+      <w:numFmt w:val="bullet"/>
+      <w:lvlText w:val=""/>
+      <w:lvlJc w:val="left"/>
+      <w:pPr>
+        <w:tabs>
+          <w:tab w:val="num" w:pos="3600"/>
+        </w:tabs>
+        <w:ind w:left="3600" w:hanging="360"/>
+      </w:pPr>
+      <w:rPr>
+        <w:rFonts w:ascii="Wingdings" w:hAnsi="Wingdings" w:hint="default"/>
+        <w:sz w:val="20"/>
+      </w:rPr>
+    </w:lvl>
+    <w:lvl w:ilvl="5" w:tentative="1">
+      <w:start w:val="1"/>
+      <w:numFmt w:val="bullet"/>
+      <w:lvlText w:val=""/>
+      <w:lvlJc w:val="left"/>
+      <w:pPr>
+        <w:tabs>
+          <w:tab w:val="num" w:pos="4320"/>
+        </w:tabs>
+        <w:ind w:left="4320" w:hanging="360"/>
+      </w:pPr>
+      <w:rPr>
+        <w:rFonts w:ascii="Wingdings" w:hAnsi="Wingdings" w:hint="default"/>
+        <w:sz w:val="20"/>
+      </w:rPr>
+    </w:lvl>
+    <w:lvl w:ilvl="6" w:tentative="1">
+      <w:start w:val="1"/>
+      <w:numFmt w:val="bullet"/>
+      <w:lvlText w:val=""/>
+      <w:lvlJc w:val="left"/>
+      <w:pPr>
+        <w:tabs>
+          <w:tab w:val="num" w:pos="5040"/>
+        </w:tabs>
+        <w:ind w:left="5040" w:hanging="360"/>
+      </w:pPr>
+      <w:rPr>
+        <w:rFonts w:ascii="Wingdings" w:hAnsi="Wingdings" w:hint="default"/>
+        <w:sz w:val="20"/>
+      </w:rPr>
+    </w:lvl>
+    <w:lvl w:ilvl="7" w:tentative="1">
+      <w:start w:val="1"/>
+      <w:numFmt w:val="bullet"/>
+      <w:lvlText w:val=""/>
+      <w:lvlJc w:val="left"/>
+      <w:pPr>
+        <w:tabs>
+          <w:tab w:val="num" w:pos="5760"/>
+        </w:tabs>
+        <w:ind w:left="5760" w:hanging="360"/>
+      </w:pPr>
+      <w:rPr>
+        <w:rFonts w:ascii="Wingdings" w:hAnsi="Wingdings" w:hint="default"/>
+        <w:sz w:val="20"/>
+      </w:rPr>
+    </w:lvl>
+    <w:lvl w:ilvl="8" w:tentative="1">
+      <w:start w:val="1"/>
+      <w:numFmt w:val="bullet"/>
+      <w:lvlText w:val=""/>
+      <w:lvlJc w:val="left"/>
+      <w:pPr>
+        <w:tabs>
+          <w:tab w:val="num" w:pos="6480"/>
+        </w:tabs>
+        <w:ind w:left="6480" w:hanging="360"/>
+      </w:pPr>
+      <w:rPr>
+        <w:rFonts w:ascii="Wingdings" w:hAnsi="Wingdings" w:hint="default"/>
+        <w:sz w:val="20"/>
+      </w:rPr>
+    </w:lvl>
+  </w:abstractNum>
+  <w:abstractNum w:abstractNumId="5" w15:restartNumberingAfterBreak="0">
     <w:nsid w:val="7C3A1C29"/>
     <w:multiLevelType w:val="hybridMultilevel"/>
     <w:tmpl w:val="F9FAB3FC"/>
@@ -6430,18 +6727,21 @@
     </w:lvl>
   </w:abstractNum>
   <w:num w:numId="1" w16cid:durableId="910697817">
-    <w:abstractNumId w:val="4"/>
+    <w:abstractNumId w:val="5"/>
   </w:num>
   <w:num w:numId="2" w16cid:durableId="1229075584">
     <w:abstractNumId w:val="1"/>
   </w:num>
   <w:num w:numId="3" w16cid:durableId="1098671757">
-    <w:abstractNumId w:val="3"/>
+    <w:abstractNumId w:val="4"/>
   </w:num>
   <w:num w:numId="4" w16cid:durableId="50689672">
     <w:abstractNumId w:val="0"/>
   </w:num>
   <w:num w:numId="5" w16cid:durableId="1339233784">
+    <w:abstractNumId w:val="3"/>
+  </w:num>
+  <w:num w:numId="6" w16cid:durableId="1947420685">
     <w:abstractNumId w:val="2"/>
   </w:num>
 </w:numbering>

</xml_diff>